<commit_message>
docs(manuel): section Recherche IA etoffee (usage, exemples, conseils)
Explication complete et non technique de la Recherche IA pour un
responsable RH : comment l'utiliser, exemples de requetes, ce que l'IA
prend en compte, conseils, limites. Ajout d'un style de sous-titre (H3).

Co-Authored-By: Claude Opus 4.8 <noreply@anthropic.com>
</commit_message>
<xml_diff>
--- a/Manuel-Utilisateur-Nexus-Talent.docx
+++ b/Manuel-Utilisateur-Nexus-Talent.docx
@@ -1313,15 +1313,242 @@
         <w:pStyle w:val="Heading2"/>
       </w:pPr>
       <w:r>
-        <w:t xml:space="preserve">Recherche IA</w:t>
-      </w:r>
-    </w:p>
-    <w:p>
-      <w:pPr>
-        <w:pStyle w:val="Body"/>
-      </w:pPr>
-      <w:r>
-        <w:t xml:space="preserve">Décrivez le profil recherché en langage courant — par exemple « chef de projet bilingue anglais, secteur bancaire » — et laissez l'IA remonter les candidats les plus pertinents de votre base.</w:t>
+        <w:t xml:space="preserve">Recherche IA — retrouver le bon profil en langage courant</w:t>
+      </w:r>
+    </w:p>
+    <w:p>
+      <w:pPr>
+        <w:pStyle w:val="Body"/>
+      </w:pPr>
+      <w:r>
+        <w:t xml:space="preserve">La Recherche IA vous permet de fouiller votre base de candidats en écrivant votre besoin comme vous le diriez à voix haute, sans mots-clés rigides ni filtres à cocher. L'intelligence artificielle lit votre demande, la compare aux profils de votre entreprise et vous propose les candidats les plus pertinents, accompagnés d'une explication.</w:t>
+      </w:r>
+    </w:p>
+    <w:p>
+      <w:pPr>
+        <w:pStyle w:val="Heading3"/>
+      </w:pPr>
+      <w:r>
+        <w:t xml:space="preserve">Comment l'utiliser</w:t>
+      </w:r>
+    </w:p>
+    <w:p>
+      <w:pPr>
+        <w:pStyle w:val="Bullet"/>
+      </w:pPr>
+      <w:r>
+        <w:t xml:space="preserve">•  </w:t>
+      </w:r>
+      <w:r>
+        <w:rPr>
+          <w:b/>
+        </w:rPr>
+        <w:t xml:space="preserve">1. </w:t>
+      </w:r>
+      <w:r>
+        <w:t xml:space="preserve">Ouvrez l'onglet « Recherche IA » dans le menu.</w:t>
+      </w:r>
+    </w:p>
+    <w:p>
+      <w:pPr>
+        <w:pStyle w:val="Bullet"/>
+      </w:pPr>
+      <w:r>
+        <w:t xml:space="preserve">•  </w:t>
+      </w:r>
+      <w:r>
+        <w:rPr>
+          <w:b/>
+        </w:rPr>
+        <w:t xml:space="preserve">2. </w:t>
+      </w:r>
+      <w:r>
+        <w:t xml:space="preserve">Décrivez le profil recherché en une phrase, en langage naturel.</w:t>
+      </w:r>
+    </w:p>
+    <w:p>
+      <w:pPr>
+        <w:pStyle w:val="Bullet"/>
+      </w:pPr>
+      <w:r>
+        <w:t xml:space="preserve">•  </w:t>
+      </w:r>
+      <w:r>
+        <w:rPr>
+          <w:b/>
+        </w:rPr>
+        <w:t xml:space="preserve">3. </w:t>
+      </w:r>
+      <w:r>
+        <w:t xml:space="preserve">Lancez la recherche : l'IA affiche une sélection de candidats et un court texte expliquant pourquoi ils ont été retenus. Cliquez sur un profil pour ouvrir sa fiche.</w:t>
+      </w:r>
+    </w:p>
+    <w:p>
+      <w:pPr>
+        <w:pStyle w:val="Heading3"/>
+      </w:pPr>
+      <w:r>
+        <w:t xml:space="preserve">Exemples de recherches</w:t>
+      </w:r>
+    </w:p>
+    <w:p>
+      <w:pPr>
+        <w:pStyle w:val="Bullet"/>
+      </w:pPr>
+      <w:r>
+        <w:t xml:space="preserve">•  </w:t>
+      </w:r>
+      <w:r>
+        <w:t xml:space="preserve">« Développeur React avec au moins 3 ans d'expérience »</w:t>
+      </w:r>
+    </w:p>
+    <w:p>
+      <w:pPr>
+        <w:pStyle w:val="Bullet"/>
+      </w:pPr>
+      <w:r>
+        <w:t xml:space="preserve">•  </w:t>
+      </w:r>
+      <w:r>
+        <w:t xml:space="preserve">« Chef de projet bilingue anglais, secteur bancaire »</w:t>
+      </w:r>
+    </w:p>
+    <w:p>
+      <w:pPr>
+        <w:pStyle w:val="Bullet"/>
+      </w:pPr>
+      <w:r>
+        <w:t xml:space="preserve">•  </w:t>
+      </w:r>
+      <w:r>
+        <w:t xml:space="preserve">« Profil DevOps maîtrisant AWS et Kubernetes »</w:t>
+      </w:r>
+    </w:p>
+    <w:p>
+      <w:pPr>
+        <w:pStyle w:val="Bullet"/>
+      </w:pPr>
+      <w:r>
+        <w:t xml:space="preserve">•  </w:t>
+      </w:r>
+      <w:r>
+        <w:t xml:space="preserve">« Comptable rigoureux avec une certification, basé à Antananarivo »</w:t>
+      </w:r>
+    </w:p>
+    <w:p>
+      <w:pPr>
+        <w:pStyle w:val="Heading3"/>
+      </w:pPr>
+      <w:r>
+        <w:t xml:space="preserve">Ce que l'IA prend en compte</w:t>
+      </w:r>
+    </w:p>
+    <w:p>
+      <w:pPr>
+        <w:pStyle w:val="Body"/>
+      </w:pPr>
+      <w:r>
+        <w:t xml:space="preserve">Elle s'appuie sur les informations issues de l'analyse des CV : compétences, années d'expérience, savoir-être, localisation, et le score d'adéquation. Plus vos candidats ont été analysés, plus la recherche est précise.</w:t>
+      </w:r>
+    </w:p>
+    <w:p>
+      <w:pPr>
+        <w:pStyle w:val="Heading3"/>
+      </w:pPr>
+      <w:r>
+        <w:t xml:space="preserve">Conseils pour de bons résultats</w:t>
+      </w:r>
+    </w:p>
+    <w:p>
+      <w:pPr>
+        <w:pStyle w:val="Bullet"/>
+      </w:pPr>
+      <w:r>
+        <w:t xml:space="preserve">•  </w:t>
+      </w:r>
+      <w:r>
+        <w:rPr>
+          <w:b/>
+        </w:rPr>
+        <w:t xml:space="preserve">Soyez précis : </w:t>
+      </w:r>
+      <w:r>
+        <w:t xml:space="preserve">mentionnez les compétences clés, le niveau d'expérience et, si utile, la localisation ou le secteur.</w:t>
+      </w:r>
+    </w:p>
+    <w:p>
+      <w:pPr>
+        <w:pStyle w:val="Bullet"/>
+      </w:pPr>
+      <w:r>
+        <w:t xml:space="preserve">•  </w:t>
+      </w:r>
+      <w:r>
+        <w:rPr>
+          <w:b/>
+        </w:rPr>
+        <w:t xml:space="preserve">Une idée par recherche : </w:t>
+      </w:r>
+      <w:r>
+        <w:t xml:space="preserve">si vous ne trouvez pas, reformulez plus simplement plutôt que d'empiler les critères.</w:t>
+      </w:r>
+    </w:p>
+    <w:p>
+      <w:pPr>
+        <w:pStyle w:val="Bullet"/>
+      </w:pPr>
+      <w:r>
+        <w:t xml:space="preserve">•  </w:t>
+      </w:r>
+      <w:r>
+        <w:rPr>
+          <w:b/>
+        </w:rPr>
+        <w:t xml:space="preserve">Analysez d'abord vos candidats : </w:t>
+      </w:r>
+      <w:r>
+        <w:t xml:space="preserve">la recherche est d'autant plus fine que les fiches ont été passées par « Analyser avec l'IA ».</w:t>
+      </w:r>
+    </w:p>
+    <w:p>
+      <w:pPr>
+        <w:pStyle w:val="Heading3"/>
+      </w:pPr>
+      <w:r>
+        <w:t xml:space="preserve">Bon à savoir</w:t>
+      </w:r>
+    </w:p>
+    <w:p>
+      <w:pPr>
+        <w:pStyle w:val="Bullet"/>
+      </w:pPr>
+      <w:r>
+        <w:t xml:space="preserve">•  </w:t>
+      </w:r>
+      <w:r>
+        <w:t xml:space="preserve">La recherche ne porte que sur les candidats de votre entreprise (vos données restent cloisonnées).</w:t>
+      </w:r>
+    </w:p>
+    <w:p>
+      <w:pPr>
+        <w:pStyle w:val="Bullet"/>
+      </w:pPr>
+      <w:r>
+        <w:t xml:space="preserve">•  </w:t>
+      </w:r>
+      <w:r>
+        <w:t xml:space="preserve">L'IA propose une aide à la décision : à vous de confirmer en ouvrant les fiches. Si un résultat vous surprend, reformulez la demande.</w:t>
+      </w:r>
+    </w:p>
+    <w:p>
+      <w:pPr>
+        <w:pStyle w:val="Bullet"/>
+      </w:pPr>
+      <w:r>
+        <w:t xml:space="preserve">•  </w:t>
+      </w:r>
+      <w:r>
+        <w:t xml:space="preserve">La recherche reste rapide même sur une grande base : l'outil présélectionne les profils les plus prometteurs avant de les faire trier par l'IA.</w:t>
       </w:r>
     </w:p>
     <w:p>
@@ -2177,6 +2404,18 @@
       <w:sz w:val="25"/>
     </w:rPr>
   </w:style>
+  <w:style w:type="paragraph" w:styleId="Heading3">
+    <w:name w:val="heading 3"/>
+    <w:pPr>
+      <w:spacing w:before="120" w:after="60"/>
+      <w:keepNext/>
+    </w:pPr>
+    <w:rPr>
+      <w:b/>
+      <w:color w:val="475569"/>
+      <w:sz w:val="22"/>
+    </w:rPr>
+  </w:style>
   <w:style w:type="paragraph" w:styleId="Bullet">
     <w:name w:val="Bullet"/>
     <w:pPr>

</xml_diff>

<commit_message>
docs(manuel): explication des indicateurs du tableau de bord
Ajout au chapitre "Decouvrir l'interface" : Score moyen IA (moyenne des
notes d'adequation IA), bloc "Competences demandees" (competences les plus
frequentes chez les candidats, avec la nuance sur le nom), et rappel des
autres graphiques (candidatures mensuelles, repartition par experience).

Co-Authored-By: Claude Opus 4.8 <noreply@anthropic.com>
</commit_message>
<xml_diff>
--- a/Manuel-Utilisateur-Nexus-Talent.docx
+++ b/Manuel-Utilisateur-Nexus-Talent.docx
@@ -696,6 +696,172 @@
       </w:r>
       <w:r>
         <w:t xml:space="preserve">votre nom, votre rôle, et l'icône de déconnexion.</w:t>
+      </w:r>
+    </w:p>
+    <w:p>
+      <w:pPr>
+        <w:pStyle w:val="Body"/>
+      </w:pPr>
+      <w:r>
+        <w:t xml:space="preserve"/>
+      </w:r>
+    </w:p>
+    <w:p>
+      <w:pPr>
+        <w:pStyle w:val="Heading2"/>
+      </w:pPr>
+      <w:r>
+        <w:t xml:space="preserve">Le tableau de bord — lire les indicateurs</w:t>
+      </w:r>
+    </w:p>
+    <w:p>
+      <w:pPr>
+        <w:pStyle w:val="Body"/>
+      </w:pPr>
+      <w:r>
+        <w:t xml:space="preserve">Le Tableau de bord est votre vue d'ensemble. En plus des compteurs (offres, candidats, embauches), deux éléments méritent une explication.</w:t>
+      </w:r>
+    </w:p>
+    <w:p>
+      <w:pPr>
+        <w:pStyle w:val="Heading3"/>
+      </w:pPr>
+      <w:r>
+        <w:t xml:space="preserve">Score moyen IA</w:t>
+      </w:r>
+    </w:p>
+    <w:p>
+      <w:pPr>
+        <w:pStyle w:val="Body"/>
+      </w:pPr>
+      <w:r>
+        <w:t xml:space="preserve">C'est le grand pourcentage repéré par l'icône « cerveau ». Il représente la MOYENNE des notes d'adéquation attribuées par l'intelligence artificielle à tous vos candidats déjà analysés. Chaque candidat passé par « Analyser avec l'IA » reçoit une note sur 100 (synthèse de ses compétences, expérience, formation, savoir-être et langues) ; le tableau de bord en fait la moyenne.</w:t>
+      </w:r>
+    </w:p>
+    <w:p>
+      <w:pPr>
+        <w:pStyle w:val="Bullet"/>
+      </w:pPr>
+      <w:r>
+        <w:t xml:space="preserve">•  </w:t>
+      </w:r>
+      <w:r>
+        <w:rPr>
+          <w:b/>
+        </w:rPr>
+        <w:t xml:space="preserve">Comment le lire : </w:t>
+      </w:r>
+      <w:r>
+        <w:t xml:space="preserve">c'est un indicateur de la qualité globale de votre vivier. Un score élevé signifie que vos candidats collent bien, en moyenne, à vos besoins ; un score bas signale un vivier plus faible ou des postes exigeants.</w:t>
+      </w:r>
+    </w:p>
+    <w:p>
+      <w:pPr>
+        <w:pStyle w:val="Bullet"/>
+      </w:pPr>
+      <w:r>
+        <w:t xml:space="preserve">•  </w:t>
+      </w:r>
+      <w:r>
+        <w:rPr>
+          <w:b/>
+        </w:rPr>
+        <w:t xml:space="preserve">À savoir : </w:t>
+      </w:r>
+      <w:r>
+        <w:t xml:space="preserve">seuls les candidats déjà analysés sont comptés. Si aucun candidat n'a été analysé, l'indicateur affiche 0 %.</w:t>
+      </w:r>
+    </w:p>
+    <w:p>
+      <w:pPr>
+        <w:pStyle w:val="Heading3"/>
+      </w:pPr>
+      <w:r>
+        <w:t xml:space="preserve">Compétences demandées</w:t>
+      </w:r>
+    </w:p>
+    <w:p>
+      <w:pPr>
+        <w:pStyle w:val="Body"/>
+      </w:pPr>
+      <w:r>
+        <w:t xml:space="preserve">C'est le graphique en radar (toile d'araignée) accompagné de quelques pastilles. Malgré son nom, il n'affiche PAS les compétences exigées par vos offres, mais les compétences LES PLUS FRÉQUENTES chez vos candidats : on compte, parmi les CV analysés, combien de candidats possèdent chaque compétence, et on met en avant les plus répandues.</w:t>
+      </w:r>
+    </w:p>
+    <w:p>
+      <w:pPr>
+        <w:pStyle w:val="Bullet"/>
+      </w:pPr>
+      <w:r>
+        <w:t xml:space="preserve">•  </w:t>
+      </w:r>
+      <w:r>
+        <w:rPr>
+          <w:b/>
+        </w:rPr>
+        <w:t xml:space="preserve">À quoi ça sert : </w:t>
+      </w:r>
+      <w:r>
+        <w:t xml:space="preserve">voir d'un coup d'œil de quoi est fait votre vivier (par exemple : beaucoup de profils maîtrisant JavaScript, Git ou Docker).</w:t>
+      </w:r>
+    </w:p>
+    <w:p>
+      <w:pPr>
+        <w:pStyle w:val="Bullet"/>
+      </w:pPr>
+      <w:r>
+        <w:t xml:space="preserve">•  </w:t>
+      </w:r>
+      <w:r>
+        <w:rPr>
+          <w:b/>
+        </w:rPr>
+        <w:t xml:space="preserve">Astuce : </w:t>
+      </w:r>
+      <w:r>
+        <w:t xml:space="preserve">ce classement se nourrit de l'analyse des CV ; plus vos candidats sont analysés, plus il est représentatif.</w:t>
+      </w:r>
+    </w:p>
+    <w:p>
+      <w:pPr>
+        <w:pStyle w:val="Heading3"/>
+      </w:pPr>
+      <w:r>
+        <w:t xml:space="preserve">Les autres graphiques</w:t>
+      </w:r>
+    </w:p>
+    <w:p>
+      <w:pPr>
+        <w:pStyle w:val="Bullet"/>
+      </w:pPr>
+      <w:r>
+        <w:t xml:space="preserve">•  </w:t>
+      </w:r>
+      <w:r>
+        <w:rPr>
+          <w:b/>
+        </w:rPr>
+        <w:t xml:space="preserve">Candidatures mensuelles : </w:t>
+      </w:r>
+      <w:r>
+        <w:t xml:space="preserve">l'évolution du nombre de candidatures reçues sur les derniers mois.</w:t>
+      </w:r>
+    </w:p>
+    <w:p>
+      <w:pPr>
+        <w:pStyle w:val="Bullet"/>
+      </w:pPr>
+      <w:r>
+        <w:t xml:space="preserve">•  </w:t>
+      </w:r>
+      <w:r>
+        <w:rPr>
+          <w:b/>
+        </w:rPr>
+        <w:t xml:space="preserve">Répartition par expérience : </w:t>
+      </w:r>
+      <w:r>
+        <w:t xml:space="preserve">combien de candidats sont Junior, Intermédiaire, Senior ou Expert, d'après les années d'expérience détectées.</w:t>
       </w:r>
     </w:p>
     <w:p>

</xml_diff>

<commit_message>
feat(dashboard): renomme "Competences demandees" -> "Competences les plus presentes"
Le bloc affiche les competences les plus frequentes chez les candidats,
pas celles exigees par les offres : le nom preter a confusion. Manuel mis
a jour en coherence.

Co-Authored-By: Claude Opus 4.8 <noreply@anthropic.com>
</commit_message>
<xml_diff>
--- a/Manuel-Utilisateur-Nexus-Talent.docx
+++ b/Manuel-Utilisateur-Nexus-Talent.docx
@@ -777,15 +777,15 @@
         <w:pStyle w:val="Heading3"/>
       </w:pPr>
       <w:r>
-        <w:t xml:space="preserve">Compétences demandées</w:t>
-      </w:r>
-    </w:p>
-    <w:p>
-      <w:pPr>
-        <w:pStyle w:val="Body"/>
-      </w:pPr>
-      <w:r>
-        <w:t xml:space="preserve">C'est le graphique en radar (toile d'araignée) accompagné de quelques pastilles. Malgré son nom, il n'affiche PAS les compétences exigées par vos offres, mais les compétences LES PLUS FRÉQUENTES chez vos candidats : on compte, parmi les CV analysés, combien de candidats possèdent chaque compétence, et on met en avant les plus répandues.</w:t>
+        <w:t xml:space="preserve">Compétences les plus présentes</w:t>
+      </w:r>
+    </w:p>
+    <w:p>
+      <w:pPr>
+        <w:pStyle w:val="Body"/>
+      </w:pPr>
+      <w:r>
+        <w:t xml:space="preserve">C'est le graphique en radar (toile d'araignée) accompagné de quelques pastilles. Il affiche les compétences les plus fréquentes chez vos candidats : on compte, parmi les CV analysés, combien de candidats possèdent chaque compétence, et on met en avant les plus répandues. (À ne pas confondre avec les compétences exigées par vos offres.)</w:t>
       </w:r>
     </w:p>
     <w:p>

</xml_diff>